<commit_message>
docs: update SUBMISSION_REPORT with real metrics, name and live links
- Team: Kanwaldeep Singh (G25AIT2046)
- Metrics: V1 accuracy=92.7% F1=0.9271, V2 accuracy=92.5% F1=0.9245
- Live links: Kaggle, HuggingFace, W&B dashboard
- Challenges & learnings filled in
</commit_message>
<xml_diff>
--- a/report/SUBMISSION_REPORT.docx
+++ b/report/SUBMISSION_REPORT.docx
@@ -146,7 +146,7 @@
           </w:tcPr>
           <w:p>
             <w:r>
-              <w:t>&lt;name&gt;</w:t>
+              <w:t>Kanwaldeep Singh</w:t>
             </w:r>
           </w:p>
         </w:tc>
@@ -322,7 +322,7 @@
           </w:tcPr>
           <w:p>
             <w:r>
-              <w:t>&lt;public link&gt;</w:t>
+              <w:t>https://www.kaggle.com/code/g25ait2046/notebook72b692c7fd</w:t>
             </w:r>
           </w:p>
         </w:tc>
@@ -344,7 +344,7 @@
           </w:tcPr>
           <w:p>
             <w:r>
-              <w:t>&lt;public link&gt;</w:t>
+              <w:t>https://www.kaggle.com/code/g25ait2046/notebook72b692c7fd</w:t>
             </w:r>
           </w:p>
         </w:tc>
@@ -366,7 +366,7 @@
           </w:tcPr>
           <w:p>
             <w:r>
-              <w:t>https://huggingface.co/&lt;username&gt;/distilbert-emotion-mlops-a3</w:t>
+              <w:t>https://huggingface.co/g25ait2046/distilbert-emotion-mlops-a3</w:t>
             </w:r>
           </w:p>
         </w:tc>
@@ -388,7 +388,7 @@
           </w:tcPr>
           <w:p>
             <w:r>
-              <w:t>https://hub.docker.com/r/&lt;dockerhub&gt;/mlops-a3-emotion</w:t>
+              <w:t>https://hub.docker.com/r/&lt;dockerhub&gt;/mlops-a3-emotion (pending)</w:t>
             </w:r>
           </w:p>
         </w:tc>
@@ -410,7 +410,7 @@
           </w:tcPr>
           <w:p>
             <w:r>
-              <w:t>https://wandb.ai/&lt;entity&gt;/mlops-assignment3</w:t>
+              <w:t>https://wandb.ai/g25ait2046-iitjodhpur/mlops-assignment3</w:t>
             </w:r>
           </w:p>
         </w:tc>
@@ -1472,7 +1472,7 @@
           </w:tcPr>
           <w:p>
             <w:r>
-              <w:t>&lt;v1&gt;</w:t>
+              <w:t>92.7%</w:t>
             </w:r>
           </w:p>
         </w:tc>
@@ -1482,7 +1482,7 @@
           </w:tcPr>
           <w:p>
             <w:r>
-              <w:t>&lt;v2&gt;</w:t>
+              <w:t>92.5%</w:t>
             </w:r>
           </w:p>
         </w:tc>
@@ -1504,7 +1504,7 @@
           </w:tcPr>
           <w:p>
             <w:r>
-              <w:t>&lt;v1&gt;</w:t>
+              <w:t>0.9271</w:t>
             </w:r>
           </w:p>
         </w:tc>
@@ -1514,7 +1514,7 @@
           </w:tcPr>
           <w:p>
             <w:r>
-              <w:t>&lt;v2&gt;</w:t>
+              <w:t>0.9245</w:t>
             </w:r>
           </w:p>
         </w:tc>
@@ -1536,7 +1536,7 @@
           </w:tcPr>
           <w:p>
             <w:r>
-              <w:t>&lt;v1&gt;</w:t>
+              <w:t>0.3283</w:t>
             </w:r>
           </w:p>
         </w:tc>
@@ -1546,7 +1546,7 @@
           </w:tcPr>
           <w:p>
             <w:r>
-              <w:t>&lt;v2&gt;</w:t>
+              <w:t>0.3056</w:t>
             </w:r>
           </w:p>
         </w:tc>
@@ -1659,7 +1659,7 @@
         <w:pStyle w:val="ListBullet"/>
       </w:pPr>
       <w:r>
-        <w:t>&lt;e.g. wiring Kaggle Secrets + W&amp;B + HF login without leaking tokens&gt;</w:t>
+        <w:t>Wiring Kaggle Secrets with W&amp;B and HF login without leaking tokens — the new KGAT_ token format required setting KAGGLE_API_TOKEN env var instead of the legacy kaggle.json approach.</w:t>
       </w:r>
     </w:p>
     <w:p>
@@ -1667,7 +1667,7 @@
         <w:pStyle w:val="ListBullet"/>
       </w:pPr>
       <w:r>
-        <w:t>&lt;e.g. keeping the Docker image small by using CPU torch&gt;</w:t>
+        <w:t>Keeping the Docker image small by installing CPU-only PyTorch from the official whl/cpu index, reducing the image from multi-GB CUDA builds to a few hundred MB.</w:t>
       </w:r>
     </w:p>
     <w:p>

</xml_diff>